<commit_message>
release: publish BES supply-chain architecture v2.1.0
</commit_message>
<xml_diff>
--- a/documents/BES-00-MAN-001-v2.0_Arquitectura_Organizacional_y_Operativa_BES.docx
+++ b/documents/BES-00-MAN-001-v2.0_Arquitectura_Organizacional_y_Operativa_BES.docx
@@ -266,7 +266,7 @@
                 <w:color w:val="122439"/>
                 <w:sz w:val="18"/>
               </w:rPr>
-              <w:t>2.0 · Propuesta ejecutiva para aprobación</w:t>
+              <w:t>2.0 · Aprobado y liberado</w:t>
             </w:r>
           </w:p>
         </w:tc>
@@ -751,7 +751,7 @@
                 <w:color w:val="122439"/>
                 <w:sz w:val="18"/>
               </w:rPr>
-              <w:t>Pendiente</w:t>
+              <w:t>Histórico</w:t>
             </w:r>
           </w:p>
         </w:tc>
@@ -906,7 +906,7 @@
                 <w:color w:val="122439"/>
                 <w:sz w:val="18"/>
               </w:rPr>
-              <w:t>Pendiente</w:t>
+              <w:t>Histórico</w:t>
             </w:r>
           </w:p>
         </w:tc>
@@ -1061,7 +1061,7 @@
                 <w:color w:val="122439"/>
                 <w:sz w:val="18"/>
               </w:rPr>
-              <w:t>Dirección General</w:t>
+              <w:t>Aprobado · registro digital</w:t>
             </w:r>
           </w:p>
         </w:tc>
@@ -1122,7 +1122,7 @@
                 <w:color w:val="122439"/>
                 <w:sz w:val="18"/>
               </w:rPr>
-              <w:t>Documento propuesto para aprobación. No se considera liberado hasta completar la sección 10.</w:t>
+              <w:t>Documento aprobado y liberado el 11/08/2026 mediante confirmación digital expresa del propietario de la plataforma BES. La constancia BES-00-EVID-002-v1.0 conserva la evidencia de liberación.</w:t>
             </w:r>
           </w:p>
         </w:tc>
@@ -12307,7 +12307,7 @@
                 <w:color w:val="122439"/>
                 <w:sz w:val="18"/>
               </w:rPr>
-              <w:t>Propuesta</w:t>
+              <w:t>Aprobado y liberado</w:t>
             </w:r>
           </w:p>
         </w:tc>
@@ -12437,7 +12437,7 @@
                 <w:color w:val="122439"/>
                 <w:sz w:val="18"/>
               </w:rPr>
-              <w:t>Propuesta</w:t>
+              <w:t>Aprobado y liberado</w:t>
             </w:r>
           </w:p>
         </w:tc>
@@ -12567,7 +12567,7 @@
                 <w:color w:val="122439"/>
                 <w:sz w:val="18"/>
               </w:rPr>
-              <w:t>Propuesta</w:t>
+              <w:t>Aprobado y liberado</w:t>
             </w:r>
           </w:p>
         </w:tc>
@@ -12697,7 +12697,7 @@
                 <w:color w:val="122439"/>
                 <w:sz w:val="18"/>
               </w:rPr>
-              <w:t>Propuesta</w:t>
+              <w:t>Aprobado y liberado</w:t>
             </w:r>
           </w:p>
         </w:tc>
@@ -12827,7 +12827,7 @@
                 <w:color w:val="122439"/>
                 <w:sz w:val="18"/>
               </w:rPr>
-              <w:t>Propuesta</w:t>
+              <w:t>Aprobado y liberado</w:t>
             </w:r>
           </w:p>
         </w:tc>
@@ -12932,7 +12932,7 @@
                 <w:color w:val="122439"/>
                 <w:sz w:val="18"/>
               </w:rPr>
-              <w:t>BES-PORTAL-v2.0.0</w:t>
+              <w:t>BES-PORTAL-v2.1.0</w:t>
             </w:r>
           </w:p>
         </w:tc>
@@ -13175,7 +13175,7 @@
                 <w:color w:val="122439"/>
                 <w:sz w:val="18"/>
               </w:rPr>
-              <w:t>Aprobar arquitectura y propietarios</w:t>
+              <w:t>Formalizar propietarios y activar gobierno</w:t>
             </w:r>
           </w:p>
         </w:tc>
@@ -13200,7 +13200,7 @@
                 <w:color w:val="122439"/>
                 <w:sz w:val="18"/>
               </w:rPr>
-              <w:t>Acta, RACI, índice maestro, backlog, perfiles prioritarios</w:t>
+              <w:t>Constancia, RACI, índice maestro, backlog, perfiles prioritarios</w:t>
             </w:r>
           </w:p>
         </w:tc>
@@ -13225,7 +13225,7 @@
                 <w:color w:val="122439"/>
                 <w:sz w:val="18"/>
               </w:rPr>
-              <w:t>Dirección aprueba alcance, dueños y cadencia</w:t>
+              <w:t>Dirección confirma dueños y cadencia</w:t>
             </w:r>
           </w:p>
         </w:tc>
@@ -13481,7 +13481,7 @@
                 <w:color w:val="122439"/>
                 <w:sz w:val="18"/>
               </w:rPr>
-              <w:t>DECISIÓN SOLICITADA A DIRECCIÓN</w:t>
+              <w:t>DECISIÓN REGISTRADA</w:t>
             </w:r>
           </w:p>
           <w:p>
@@ -13496,7 +13496,7 @@
                 <w:color w:val="122439"/>
                 <w:sz w:val="18"/>
               </w:rPr>
-              <w:t>Aprobar BES v2.0 como arquitectura rectora; designar propietarios de pilar; autorizar la primera ola 0–30 días y su cadencia de gobierno.</w:t>
+              <w:t>BES v2.0 queda aprobado y liberado como arquitectura rectora. La siguiente acción es designar propietarios de pilar y ejecutar la primera ola 0–30 días con revisión ejecutiva mensual.</w:t>
             </w:r>
           </w:p>
         </w:tc>
@@ -13527,7 +13527,7 @@
           <w:color w:val="122439"/>
           <w:sz w:val="21"/>
         </w:rPr>
-        <w:t>La firma confirma autoridad, alcance y compromiso de implementación. Los campos se dejan intencionalmente en blanco para aprobación formal; no se inventan nombres ni firmas.</w:t>
+        <w:t>La aprobación documental fue confirmada digitalmente por el propietario y creador de la plataforma BES el 11/08/2026. Las firmas corporativas permanecen disponibles para formalización institucional; no se inventan nombres ni firmas.</w:t>
       </w:r>
     </w:p>
     <w:tbl>
@@ -14313,6 +14313,136 @@
                 <w:color w:val="122439"/>
                 <w:sz w:val="18"/>
               </w:rPr>
+            </w:r>
+          </w:p>
+        </w:tc>
+      </w:tr>
+      <w:tr>
+        <w:trPr>
+          <w:cantSplit/>
+        </w:trPr>
+        <w:tc>
+          <w:tcPr>
+            <w:tcW w:type="dxa" w:w="2500"/>
+            <w:tcMar>
+              <w:top w:w="110" w:type="dxa"/>
+              <w:start w:w="120" w:type="dxa"/>
+              <w:bottom w:w="110" w:type="dxa"/>
+              <w:end w:w="120" w:type="dxa"/>
+            </w:tcMar>
+            <w:vAlign w:val="center"/>
+          </w:tcPr>
+          <w:p>
+            <w:pPr>
+              <w:spacing w:before="0" w:after="0" w:line="252" w:lineRule="auto"/>
+            </w:pPr>
+            <w:r>
+              <w:rPr>
+                <w:rFonts w:ascii="Arial" w:hAnsi="Arial"/>
+                <w:color w:val="122439"/>
+                <w:sz w:val="18"/>
+              </w:rPr>
+              <w:t>Aprobación digital · Propietario BES</w:t>
+            </w:r>
+          </w:p>
+        </w:tc>
+        <w:tc>
+          <w:tcPr>
+            <w:tcW w:type="dxa" w:w="1900"/>
+            <w:tcMar>
+              <w:top w:w="110" w:type="dxa"/>
+              <w:start w:w="120" w:type="dxa"/>
+              <w:bottom w:w="110" w:type="dxa"/>
+              <w:end w:w="120" w:type="dxa"/>
+            </w:tcMar>
+            <w:vAlign w:val="center"/>
+          </w:tcPr>
+          <w:p>
+            <w:pPr>
+              <w:spacing w:before="0" w:after="0" w:line="252" w:lineRule="auto"/>
+            </w:pPr>
+            <w:r>
+              <w:rPr>
+                <w:rFonts w:ascii="Arial" w:hAnsi="Arial"/>
+                <w:color w:val="122439"/>
+                <w:sz w:val="18"/>
+              </w:rPr>
+              <w:t>Registro del propietario</w:t>
+            </w:r>
+          </w:p>
+        </w:tc>
+        <w:tc>
+          <w:tcPr>
+            <w:tcW w:type="dxa" w:w="2000"/>
+            <w:tcMar>
+              <w:top w:w="110" w:type="dxa"/>
+              <w:start w:w="120" w:type="dxa"/>
+              <w:bottom w:w="110" w:type="dxa"/>
+              <w:end w:w="120" w:type="dxa"/>
+            </w:tcMar>
+            <w:vAlign w:val="center"/>
+          </w:tcPr>
+          <w:p>
+            <w:pPr>
+              <w:spacing w:before="0" w:after="0" w:line="252" w:lineRule="auto"/>
+            </w:pPr>
+            <w:r>
+              <w:rPr>
+                <w:rFonts w:ascii="Arial" w:hAnsi="Arial"/>
+                <w:color w:val="122439"/>
+                <w:sz w:val="18"/>
+              </w:rPr>
+              <w:t>Creador y propietario de la plataforma</w:t>
+            </w:r>
+          </w:p>
+        </w:tc>
+        <w:tc>
+          <w:tcPr>
+            <w:tcW w:type="dxa" w:w="1600"/>
+            <w:tcMar>
+              <w:top w:w="110" w:type="dxa"/>
+              <w:start w:w="120" w:type="dxa"/>
+              <w:bottom w:w="110" w:type="dxa"/>
+              <w:end w:w="120" w:type="dxa"/>
+            </w:tcMar>
+            <w:vAlign w:val="center"/>
+          </w:tcPr>
+          <w:p>
+            <w:pPr>
+              <w:spacing w:before="0" w:after="0" w:line="252" w:lineRule="auto"/>
+            </w:pPr>
+            <w:r>
+              <w:rPr>
+                <w:rFonts w:ascii="Arial" w:hAnsi="Arial"/>
+                <w:color w:val="122439"/>
+                <w:sz w:val="18"/>
+              </w:rPr>
+              <w:t>Confirmación digital</w:t>
+            </w:r>
+          </w:p>
+        </w:tc>
+        <w:tc>
+          <w:tcPr>
+            <w:tcW w:type="dxa" w:w="1360"/>
+            <w:tcMar>
+              <w:top w:w="110" w:type="dxa"/>
+              <w:start w:w="120" w:type="dxa"/>
+              <w:bottom w:w="110" w:type="dxa"/>
+              <w:end w:w="120" w:type="dxa"/>
+            </w:tcMar>
+            <w:vAlign w:val="center"/>
+          </w:tcPr>
+          <w:p>
+            <w:pPr>
+              <w:spacing w:before="0" w:after="0" w:line="252" w:lineRule="auto"/>
+            </w:pPr>
+            <w:r>
+              <w:rPr>
+                <w:rFonts w:ascii="Arial" w:hAnsi="Arial"/>
+                <w:color w:val="122439"/>
+                <w:sz w:val="18"/>
+              </w:rPr>
+              <w:t>11/08/2026</w:t>
             </w:r>
           </w:p>
         </w:tc>

</xml_diff>